<commit_message>
AI timeline since GPT-2 on home and CV; refreshed CV downloads; Job Gallery count corrected to 49
</commit_message>
<xml_diff>
--- a/cv/Charles_Forsyth_Academic_CV.docx
+++ b/cv/Charles_Forsyth_Academic_CV.docx
@@ -87,7 +87,7 @@
           <w:i w:val="0"/>
           <w:sz w:val="20"/>
         </w:rPr>
-        <w:t>Research computing and AI executive with 30+ years in technology, from Navy radar to high-performance computing to generative AI. As Director of Research Computing at UC Riverside, I run the cloud, cluster, storage, security and AI services behind about 1,000 researchers in 22 colleges and schools, and I still build the platforms myself, now with a team of AI agents. I led UCR's first-of-its-kind research partnership with Google Cloud, served as Co-PI on a $498K NSF CC* research storage award, and chaired the UC Research IT Committee across every UC campus. I have been building with AI since the GPT-2 and BERT era and shipped an LLM assistant for HPC users in 2023. The number I manage to is time to science.</w:t>
+        <w:t>Research computing and AI executive with 30+ years in technology, from Navy radar to high-performance computing to generative AI. As Director of Research Computing at UC Riverside, I run the cloud, cluster, storage, security and AI services behind about 1,000 researchers in 22 colleges and schools, and I still build the platforms myself, now with a team of AI agents. I led UCR's first-of-its-kind research partnership with Google Cloud, served as Co-PI on a $498K NSF CC* research storage award, and chaired the UC Research IT Committee across every UC campus. I have been building with AI since the GPT-2 era, running GPU jobs for it on the National Research Platform in 2020, and shipped an LLM assistant for HPC users in 2023. The number I manage to is time to science.</w:t>
       </w:r>
     </w:p>
     <w:p>
@@ -316,7 +316,7 @@
         <w:rPr>
           <w:sz w:val="20"/>
         </w:rPr>
-        <w:t>Direct a team of AI agents shipping production software under written specs, test gates and human approval.</w:t>
+        <w:t>Direct a team of AI agents shipping production software under written specs, test gates and human approval (Directed Agentic Engineering).</w:t>
       </w:r>
     </w:p>
     <w:p>
@@ -329,7 +329,7 @@
         <w:rPr>
           <w:sz w:val="20"/>
         </w:rPr>
-        <w:t>Data security plans and secure enclaves for P3/P4 and CMMC research with the Information Security Office; built ursa-dsp to triage, lint and assemble plans.</w:t>
+        <w:t>Data security plans and secure enclaves for P3/P4 and CMMC research with the ISO.</w:t>
       </w:r>
     </w:p>
     <w:p>
@@ -488,6 +488,45 @@
     </w:p>
     <w:p>
       <w:pPr>
+        <w:pStyle w:val="ListBullet"/>
+        <w:spacing w:before="0" w:after="30"/>
+        <w:ind w:left="317" w:hanging="230"/>
+      </w:pPr>
+      <w:r>
+        <w:rPr>
+          <w:sz w:val="20"/>
+        </w:rPr>
+        <w:t>Onboarded UCR researchers to the Pacific Research Platform's Nautilus GPU cluster: Kubernetes job templates, TensorFlow and PyTorch GPU pods (2019), GPT-2 GPU jobs on NVIDIA RTX 8000 (2020) and UCR Nautilus cluster tools.</w:t>
+      </w:r>
+    </w:p>
+    <w:p>
+      <w:pPr>
+        <w:pStyle w:val="ListBullet"/>
+        <w:spacing w:before="0" w:after="30"/>
+        <w:ind w:left="317" w:hanging="230"/>
+      </w:pPr>
+      <w:r>
+        <w:rPr>
+          <w:sz w:val="20"/>
+        </w:rPr>
+        <w:t>Published Google Colab notebooks for researchers: action recognition, object detection and image enhancement (2020), Stable Diffusion and Disco Diffusion (2022).</w:t>
+      </w:r>
+    </w:p>
+    <w:p>
+      <w:pPr>
+        <w:pStyle w:val="ListBullet"/>
+        <w:spacing w:before="0" w:after="30"/>
+        <w:ind w:left="317" w:hanging="230"/>
+      </w:pPr>
+      <w:r>
+        <w:rPr>
+          <w:sz w:val="20"/>
+        </w:rPr>
+        <w:t>Ran a Terraform infrastructure-as-code workshop for AWS and Google Cloud (2020).</w:t>
+      </w:r>
+    </w:p>
+    <w:p>
+      <w:pPr>
         <w:tabs>
           <w:tab w:pos="9907" w:val="right"/>
         </w:tabs>
@@ -1136,6 +1175,163 @@
           <w:color w:val="1F3A5F"/>
           <w:sz w:val="21"/>
         </w:rPr>
+        <w:t>AI WORK TIMELINE</w:t>
+      </w:r>
+    </w:p>
+    <w:p>
+      <w:pPr>
+        <w:pStyle w:val="ListBullet"/>
+        <w:spacing w:before="0" w:after="30"/>
+        <w:ind w:left="317" w:hanging="230"/>
+      </w:pPr>
+      <w:r>
+        <w:rPr>
+          <w:b/>
+          <w:sz w:val="20"/>
+        </w:rPr>
+        <w:t xml:space="preserve">2019: </w:t>
+      </w:r>
+      <w:r>
+        <w:rPr>
+          <w:sz w:val="20"/>
+        </w:rPr>
+        <w:t>TensorFlow and PyTorch GPU pods for UCR researchers on the National Research Platform.</w:t>
+      </w:r>
+    </w:p>
+    <w:p>
+      <w:pPr>
+        <w:pStyle w:val="ListBullet"/>
+        <w:spacing w:before="0" w:after="30"/>
+        <w:ind w:left="317" w:hanging="230"/>
+      </w:pPr>
+      <w:r>
+        <w:rPr>
+          <w:b/>
+          <w:sz w:val="20"/>
+        </w:rPr>
+        <w:t xml:space="preserve">2020: </w:t>
+      </w:r>
+      <w:r>
+        <w:rPr>
+          <w:sz w:val="20"/>
+        </w:rPr>
+        <w:t>GPT-2 GPU jobs (NVIDIA RTX 8000) on Nautilus; deep learning notebooks for researchers.</w:t>
+      </w:r>
+    </w:p>
+    <w:p>
+      <w:pPr>
+        <w:pStyle w:val="ListBullet"/>
+        <w:spacing w:before="0" w:after="30"/>
+        <w:ind w:left="317" w:hanging="230"/>
+      </w:pPr>
+      <w:r>
+        <w:rPr>
+          <w:b/>
+          <w:sz w:val="20"/>
+        </w:rPr>
+        <w:t xml:space="preserve">2022: </w:t>
+      </w:r>
+      <w:r>
+        <w:rPr>
+          <w:sz w:val="20"/>
+        </w:rPr>
+        <w:t>Stable Diffusion and Disco Diffusion notebooks for researchers, before ChatGPT launched.</w:t>
+      </w:r>
+    </w:p>
+    <w:p>
+      <w:pPr>
+        <w:pStyle w:val="ListBullet"/>
+        <w:spacing w:before="0" w:after="30"/>
+        <w:ind w:left="317" w:hanging="230"/>
+      </w:pPr>
+      <w:r>
+        <w:rPr>
+          <w:b/>
+          <w:sz w:val="20"/>
+        </w:rPr>
+        <w:t xml:space="preserve">2023: </w:t>
+      </w:r>
+      <w:r>
+        <w:rPr>
+          <w:sz w:val="20"/>
+        </w:rPr>
+        <w:t>Ursa Major Ask, a GPT-3.5 assistant that writes and runs research code and Slurm scripts.</w:t>
+      </w:r>
+    </w:p>
+    <w:p>
+      <w:pPr>
+        <w:pStyle w:val="ListBullet"/>
+        <w:spacing w:before="0" w:after="30"/>
+        <w:ind w:left="317" w:hanging="230"/>
+      </w:pPr>
+      <w:r>
+        <w:rPr>
+          <w:b/>
+          <w:sz w:val="20"/>
+        </w:rPr>
+        <w:t xml:space="preserve">2024: </w:t>
+      </w:r>
+      <w:r>
+        <w:rPr>
+          <w:sz w:val="20"/>
+        </w:rPr>
+        <w:t>uma, an LLM in the Linux shell for HPC users.</w:t>
+      </w:r>
+    </w:p>
+    <w:p>
+      <w:pPr>
+        <w:pStyle w:val="ListBullet"/>
+        <w:spacing w:before="0" w:after="30"/>
+        <w:ind w:left="317" w:hanging="230"/>
+      </w:pPr>
+      <w:r>
+        <w:rPr>
+          <w:b/>
+          <w:sz w:val="20"/>
+        </w:rPr>
+        <w:t xml:space="preserve">2025: </w:t>
+      </w:r>
+      <w:r>
+        <w:rPr>
+          <w:sz w:val="20"/>
+        </w:rPr>
+        <w:t>Gemini multimodal video analysis, multi-agent simulations, generative media tools, deep-research.</w:t>
+      </w:r>
+    </w:p>
+    <w:p>
+      <w:pPr>
+        <w:pStyle w:val="ListBullet"/>
+        <w:spacing w:before="0" w:after="30"/>
+        <w:ind w:left="317" w:hanging="230"/>
+      </w:pPr>
+      <w:r>
+        <w:rPr>
+          <w:b/>
+          <w:sz w:val="20"/>
+        </w:rPr>
+        <w:t xml:space="preserve">2026: </w:t>
+      </w:r>
+      <w:r>
+        <w:rPr>
+          <w:sz w:val="20"/>
+        </w:rPr>
+        <w:t>MCP servers for HPC, research systems and NRP; UCR AI Gateway; Directed Agentic Engineering.</w:t>
+      </w:r>
+    </w:p>
+    <w:p>
+      <w:pPr>
+        <w:spacing w:before="180" w:after="40"/>
+        <w:pBdr>
+          <w:bottom w:val="single" w:sz="6" w:space="1" w:color="1F3A5F"/>
+        </w:pBdr>
+      </w:pPr>
+      <w:r>
+        <w:rPr>
+          <w:b/>
+          <w:i w:val="0"/>
+          <w:color w:val="1F3A5F"/>
+          <w:sz w:val="21"/>
+        </w:rPr>
         <w:t>AI AND RESEARCH PLATFORMS BUILT</w:t>
       </w:r>
     </w:p>
@@ -1330,6 +1526,106 @@
           <w:b/>
           <w:sz w:val="20"/>
         </w:rPr>
+        <w:t xml:space="preserve">UCR HPC Job Gallery (2026): </w:t>
+      </w:r>
+      <w:r>
+        <w:rPr>
+          <w:sz w:val="20"/>
+        </w:rPr>
+        <w:t>49 tested, standardized Slurm workflows across seven colleges and schools (including AlphaFold, from bioengineering to social science), with README, index and HTML gallery generated from the scripts. github.com/charles-forsyth/UCR-HPC-Job-Gallery</w:t>
+      </w:r>
+    </w:p>
+    <w:p>
+      <w:pPr>
+        <w:pStyle w:val="ListBullet"/>
+        <w:spacing w:before="0" w:after="30"/>
+        <w:ind w:left="317" w:hanging="230"/>
+      </w:pPr>
+      <w:r>
+        <w:rPr>
+          <w:b/>
+          <w:sz w:val="20"/>
+        </w:rPr>
+        <w:t xml:space="preserve">squad-manager (2026): </w:t>
+      </w:r>
+      <w:r>
+        <w:rPr>
+          <w:sz w:val="20"/>
+        </w:rPr>
+        <w:t>Directed Agentic Engineering: orchestrates squads of specialized AI agents (architect, test writer, DevOps, developer, security gatekeeper, user acceptance) to design, build, test and release software. github.com/charles-forsyth/squad-manager</w:t>
+      </w:r>
+    </w:p>
+    <w:p>
+      <w:pPr>
+        <w:pStyle w:val="ListBullet"/>
+        <w:spacing w:before="0" w:after="30"/>
+        <w:ind w:left="317" w:hanging="230"/>
+      </w:pPr>
+      <w:r>
+        <w:rPr>
+          <w:b/>
+          <w:sz w:val="20"/>
+        </w:rPr>
+        <w:t xml:space="preserve">Generative AI media tools (2025): </w:t>
+      </w:r>
+      <w:r>
+        <w:rPr>
+          <w:sz w:val="20"/>
+        </w:rPr>
+        <w:t>CLIs for Google Veo 3.1 video, Lyria music and Gemini TTS, and a Gemini multimodal video analyzer for research footage. github.com/UCR-Research-Computing/gemini-video-analyzer</w:t>
+      </w:r>
+    </w:p>
+    <w:p>
+      <w:pPr>
+        <w:pStyle w:val="ListBullet"/>
+        <w:spacing w:before="0" w:after="30"/>
+        <w:ind w:left="317" w:hanging="230"/>
+      </w:pPr>
+      <w:r>
+        <w:rPr>
+          <w:b/>
+          <w:sz w:val="20"/>
+        </w:rPr>
+        <w:t xml:space="preserve">TPU and accelerator demos (2026): </w:t>
+      </w:r>
+      <w:r>
+        <w:rPr>
+          <w:sz w:val="20"/>
+        </w:rPr>
+        <w:t>JAX/Flax demos on Google Cloud TPU v5e for science disciplines and a CUDA-to-TPU porting demo. github.com/charles-forsyth/TPU-Demos</w:t>
+      </w:r>
+    </w:p>
+    <w:p>
+      <w:pPr>
+        <w:pStyle w:val="ListBullet"/>
+        <w:spacing w:before="0" w:after="30"/>
+        <w:ind w:left="317" w:hanging="230"/>
+      </w:pPr>
+      <w:r>
+        <w:rPr>
+          <w:b/>
+          <w:sz w:val="20"/>
+        </w:rPr>
+        <w:t xml:space="preserve">Browser AI demos (2025): </w:t>
+      </w:r>
+      <w:r>
+        <w:rPr>
+          <w:sz w:val="20"/>
+        </w:rPr>
+        <w:t>Live webcam hand tracking (MediaPipe), reinforcement-learning game agents, an HPC workflow simulator and a public voice AI agent. lordivxx.github.io</w:t>
+      </w:r>
+    </w:p>
+    <w:p>
+      <w:pPr>
+        <w:pStyle w:val="ListBullet"/>
+        <w:spacing w:before="0" w:after="30"/>
+        <w:ind w:left="317" w:hanging="230"/>
+      </w:pPr>
+      <w:r>
+        <w:rPr>
+          <w:b/>
+          <w:sz w:val="20"/>
+        </w:rPr>
         <w:t xml:space="preserve">Ursa Major Ask (2023) and uma (2024): </w:t>
       </w:r>
       <w:r>
@@ -1449,6 +1745,32 @@
           <w:sz w:val="20"/>
         </w:rPr>
         <w:t>Connecting to XSEDE resources (Stampede2); Windows applications on Linux clusters (2017-2019)</w:t>
+      </w:r>
+    </w:p>
+    <w:p>
+      <w:pPr>
+        <w:pStyle w:val="ListBullet"/>
+        <w:spacing w:before="0" w:after="30"/>
+        <w:ind w:left="317" w:hanging="230"/>
+      </w:pPr>
+      <w:r>
+        <w:rPr>
+          <w:sz w:val="20"/>
+        </w:rPr>
+        <w:t>Terraform infrastructure-as-code workshop, AWS and Google Cloud (2020)</w:t>
+      </w:r>
+    </w:p>
+    <w:p>
+      <w:pPr>
+        <w:pStyle w:val="ListBullet"/>
+        <w:spacing w:before="0" w:after="30"/>
+        <w:ind w:left="317" w:hanging="230"/>
+      </w:pPr>
+      <w:r>
+        <w:rPr>
+          <w:sz w:val="20"/>
+        </w:rPr>
+        <w:t>National Research Platform (Nautilus) researcher guide, 8 articles (UCR KB023-KB030, 2026)</w:t>
       </w:r>
     </w:p>
     <w:p>

</xml_diff>

<commit_message>
CV: matrix leadership, RITL founder, Research Advisory Board, Senate research committee, PI status
</commit_message>
<xml_diff>
--- a/cv/Charles_Forsyth_Academic_CV.docx
+++ b/cv/Charles_Forsyth_Academic_CV.docx
@@ -87,7 +87,7 @@
           <w:i w:val="0"/>
           <w:sz w:val="20"/>
         </w:rPr>
-        <w:t>Research computing and AI executive with 30+ years in technology, from Navy radar to high-performance computing to generative AI. As Director of Research Computing at UC Riverside, I run the cloud, cluster, storage, security and AI services behind about 1,000 researchers in 22 colleges and schools, and I still build the platforms myself, now with a team of AI agents. I led UCR's first-of-its-kind research partnership with Google Cloud, served as Co-PI on a $498K NSF CC* research storage award, and chaired the UC Research IT Committee across every UC campus. I have been building with AI since the GPT-2 era, running GPU jobs for it on the National Research Platform in 2020, and shipped an LLM assistant for HPC users in 2023. The number I manage to is time to science.</w:t>
+        <w:t>Research computing and AI executive with 30+ years in technology, from Navy radar to high-performance computing to generative AI. As Director of Research Computing at UC Riverside, I lead a matrix team of about 20 across ITS and the colleges and run the cloud, cluster, storage, security and AI services behind about 1,000 researchers in 22 colleges and schools, and I still build the platforms myself, now with a team of AI agents. I led UCR's first-of-its-kind research partnership with Google Cloud, served as Co-PI on a $498K NSF CC* research storage award, and chaired the UC Research IT Committee across every UC campus. I have been building with AI since the GPT-2 era, running GPU jobs for it on the National Research Platform in 2020, and shipped an LLM assistant for HPC users in 2023. The number I manage to is time to science.</w:t>
       </w:r>
     </w:p>
     <w:p>
@@ -178,13 +178,13 @@
           <w:b/>
           <w:sz w:val="20"/>
         </w:rPr>
-        <w:t xml:space="preserve">Systemwide leadership: </w:t>
+        <w:t xml:space="preserve">Campus and systemwide leadership: </w:t>
       </w:r>
       <w:r>
         <w:rPr>
           <w:sz w:val="20"/>
         </w:rPr>
-        <w:t>Chair of the UC Research IT Committee (2022-2024) after a year as Vice Chair, uniting research IT leaders from every UC campus.</w:t>
+        <w:t>founded and lead UCR Research IT Leaders; Research Advisory Board and Academic Senate research committee; Chair of the UC Research IT Committee (2022-2024), uniting research IT leaders from every UC campus.</w:t>
       </w:r>
     </w:p>
     <w:p>
@@ -251,7 +251,7 @@
           <w:i w:val="0"/>
           <w:sz w:val="20"/>
         </w:rPr>
-        <w:t>Lead research computing strategy, services and AI for UCR's research enterprise: about 1,000 researchers in 22 colleges and schools.</w:t>
+        <w:t>Lead research computing strategy, services and AI for about 1,000 researchers in 22 colleges and schools through a matrix team of about 20: direct reports and student staff, the ITS systems team (dotted line for research) and research IT staff in colleges, centers and units across campus.</w:t>
       </w:r>
     </w:p>
     <w:p>
@@ -316,7 +316,7 @@
         <w:rPr>
           <w:sz w:val="20"/>
         </w:rPr>
-        <w:t>Direct a team of AI agents shipping production software under written specs, test gates and human approval (Directed Agentic Engineering).</w:t>
+        <w:t>Data security plans and secure enclaves for P3/P4 and CMMC research with the ISO.</w:t>
       </w:r>
     </w:p>
     <w:p>
@@ -329,7 +329,7 @@
         <w:rPr>
           <w:sz w:val="20"/>
         </w:rPr>
-        <w:t>Data security plans and secure enclaves for P3/P4 and CMMC research with the ISO.</w:t>
+        <w:t>Founded and lead UCR Research IT Leaders, which coordinates research IT across campus; serve on the Research Advisory Board and the Academic Senate research committee.</w:t>
       </w:r>
     </w:p>
     <w:p>
@@ -342,7 +342,7 @@
         <w:rPr>
           <w:sz w:val="20"/>
         </w:rPr>
-        <w:t>Chair, UCR Research IT Leaders; NSF ACCESS and NAIRR advocate; grant strategy.</w:t>
+        <w:t>Official UCR PI status (2024); grant strategy; ship software with a team of AI agents under written specs, test gates and human approval.</w:t>
       </w:r>
     </w:p>
     <w:p>
@@ -1839,7 +1839,46 @@
         <w:rPr>
           <w:sz w:val="20"/>
         </w:rPr>
-        <w:t>Chair, UCR Research IT Leaders (Present)</w:t>
+        <w:t>Founder and Chair, UCR Research IT Leaders (RITL), coordinating research IT across campus (Present)</w:t>
+      </w:r>
+    </w:p>
+    <w:p>
+      <w:pPr>
+        <w:pStyle w:val="ListBullet"/>
+        <w:spacing w:before="0" w:after="30"/>
+        <w:ind w:left="317" w:hanging="230"/>
+      </w:pPr>
+      <w:r>
+        <w:rPr>
+          <w:sz w:val="20"/>
+        </w:rPr>
+        <w:t>Member, UCR Research Advisory Board (Present)</w:t>
+      </w:r>
+    </w:p>
+    <w:p>
+      <w:pPr>
+        <w:pStyle w:val="ListBullet"/>
+        <w:spacing w:before="0" w:after="30"/>
+        <w:ind w:left="317" w:hanging="230"/>
+      </w:pPr>
+      <w:r>
+        <w:rPr>
+          <w:sz w:val="20"/>
+        </w:rPr>
+        <w:t>Member, UCR Academic Senate research committee (Present)</w:t>
+      </w:r>
+    </w:p>
+    <w:p>
+      <w:pPr>
+        <w:pStyle w:val="ListBullet"/>
+        <w:spacing w:before="0" w:after="30"/>
+        <w:ind w:left="317" w:hanging="230"/>
+      </w:pPr>
+      <w:r>
+        <w:rPr>
+          <w:sz w:val="20"/>
+        </w:rPr>
+        <w:t>Official UCR Principal Investigator status (2024 - Present)</w:t>
       </w:r>
     </w:p>
     <w:p>

</xml_diff>

<commit_message>
CV: HPCC rebuild (cluster, server room, power/cooling, Ansible, PXE); wrote CC* proposal and budget; designed CephRDS and cost recovery
</commit_message>
<xml_diff>
--- a/cv/Charles_Forsyth_Academic_CV.docx
+++ b/cv/Charles_Forsyth_Academic_CV.docx
@@ -277,7 +277,7 @@
         <w:rPr>
           <w:sz w:val="20"/>
         </w:rPr>
-        <w:t>Co-PI of NSF CC* 2346636 (CephRDS, 2.09 PB usable); six science driver labs migrated, 422 TB federated to the National Research Platform.</w:t>
+        <w:t>Wrote NSF CC* proposal 2346636 and its budget (Co-PI); designed CephRDS (2.09 PB usable) and its cost recovery model; six science driver labs migrated, 422 TB federated to the National Research Platform.</w:t>
       </w:r>
     </w:p>
     <w:p>
@@ -635,7 +635,33 @@
           <w:color w:val="444444"/>
           <w:sz w:val="19"/>
         </w:rPr>
-        <w:t>University of California, Riverside, Riverside, CA</w:t>
+        <w:t>UC Riverside, High Performance Computing Center (HPCC), Riverside, CA</w:t>
+      </w:r>
+    </w:p>
+    <w:p>
+      <w:pPr>
+        <w:pStyle w:val="ListBullet"/>
+        <w:spacing w:before="0" w:after="30"/>
+        <w:ind w:left="317" w:hanging="230"/>
+      </w:pPr>
+      <w:r>
+        <w:rPr>
+          <w:sz w:val="20"/>
+        </w:rPr>
+        <w:t>Rebuilt the HPCC campus cluster and the server room it runs in, including new power and cooling.</w:t>
+      </w:r>
+    </w:p>
+    <w:p>
+      <w:pPr>
+        <w:pStyle w:val="ListBullet"/>
+        <w:spacing w:before="0" w:after="30"/>
+        <w:ind w:left="317" w:hanging="230"/>
+      </w:pPr>
+      <w:r>
+        <w:rPr>
+          <w:sz w:val="20"/>
+        </w:rPr>
+        <w:t>Moved cluster configuration management to Ansible and set up PXE bare-metal provisioning.</w:t>
       </w:r>
     </w:p>
     <w:p>
@@ -1158,7 +1184,7 @@
         <w:rPr>
           <w:sz w:val="20"/>
         </w:rPr>
-        <w:t>National Science Foundation, CC* Data Storage: Foundational Campus Research Storage for Digital Transformation, award 2346636, $498,553, Mar 2024 - Feb 2026. Co-PI (PI: Michael Kennedy). Delivered CephRDS: 2.09 PB usable (3.2 PB raw), 20 nodes on the 100 Gbps Science DMZ, 422 TB federated to the National Research Platform.</w:t>
+        <w:t>National Science Foundation, CC* Data Storage: Foundational Campus Research Storage for Digital Transformation, award 2346636, $498,553, Mar 2024 - Feb 2026. Co-PI. Wrote the full proposal, budget and justification, and the PI and Co-PI documents under the NSF PAPPG, in one month. Delivered CephRDS: 2.09 PB usable (3.2 PB raw), 20 nodes on the 100 Gbps Science DMZ, 422 TB federated to the National Research Platform.</w:t>
       </w:r>
     </w:p>
     <w:p>

</xml_diff>

<commit_message>
CV: 19 HPCC workshops taught (2017-2019) and authored training decks
</commit_message>
<xml_diff>
--- a/cv/Charles_Forsyth_Academic_CV.docx
+++ b/cv/Charles_Forsyth_Academic_CV.docx
@@ -713,7 +713,7 @@
         <w:rPr>
           <w:sz w:val="20"/>
         </w:rPr>
-        <w:t>Taught Linux, HPC cluster and Python classes and seminars.</w:t>
+        <w:t>Taught 19 HPCC workshops for UCR researchers and students (Jul 2017 - Jun 2019; sole instructor on 10): Linux and cluster basics, Python, software installation, and an HPCC + AWS cloud cluster service; wrote the four training decks.</w:t>
       </w:r>
     </w:p>
     <w:p>
@@ -1731,7 +1731,7 @@
         <w:rPr>
           <w:sz w:val="20"/>
         </w:rPr>
-        <w:t>Introduction to Python, UCR High Performance Computing Center (2017-2019)</w:t>
+        <w:t>HPCC workshops, UCR High Performance Computing Center, 19 sessions, Jul 2017 - Jun 2019 (sole instructor on 10; others with Jordan Hayes and Thomas Girke), Genomics Building Auditorium: HPCC Cluster Intro (2017-2018); Linux Basics and HPCC Cluster Introduction (2018-2019); Basic Linux, Cluster Intro and Software Installation (Sep 2018); Introduction to Python (Oct 2018); Research Computing in UCR's HPC Center (Oct 2018). Authored decks: HPCC Cluster Intro (43 slides), Linux Basics and HPCC Cluster Intro (53), Introduction to Python (30).</w:t>
       </w:r>
     </w:p>
     <w:p>
@@ -1744,20 +1744,7 @@
         <w:rPr>
           <w:sz w:val="20"/>
         </w:rPr>
-        <w:t>Linux Basics and HPCC Cluster Introduction; Using the HPCC Linux Cluster (2017-2019)</w:t>
-      </w:r>
-    </w:p>
-    <w:p>
-      <w:pPr>
-        <w:pStyle w:val="ListBullet"/>
-        <w:spacing w:before="0" w:after="30"/>
-        <w:ind w:left="317" w:hanging="230"/>
-      </w:pPr>
-      <w:r>
-        <w:rPr>
-          <w:sz w:val="20"/>
-        </w:rPr>
-        <w:t>HPC in the Cloud: building custom HPC clusters in AWS with Python (2017-2019)</w:t>
+        <w:t>HPCC Cloud Service presentation: HPC clusters in AWS on demand, HPCC AWS Cluster deck (36 slides), Apr 2018. Workshop list and decks: hpcc.ucr.edu/events/events/</w:t>
       </w:r>
     </w:p>
     <w:p>

</xml_diff>

<commit_message>
CV: HPCC Cloud Service (on-demand AWS clusters via hpcc_cloud), module and site commits
</commit_message>
<xml_diff>
--- a/cv/Charles_Forsyth_Academic_CV.docx
+++ b/cv/Charles_Forsyth_Academic_CV.docx
@@ -687,7 +687,20 @@
         <w:rPr>
           <w:sz w:val="20"/>
         </w:rPr>
-        <w:t>Built and ran on-demand HPC clusters in AWS.</w:t>
+        <w:t>Built the HPCC Cloud Service (2017-2018): lab-private HPC clusters in AWS on demand, created from the HPCC cluster with hpcc_cloud, a cfnCluster wrapper I wrote (GPU, high-memory and autoscaling nodes, per-minute billing, budget alerts); wrote its manuals and maintained its software modules.</w:t>
+      </w:r>
+    </w:p>
+    <w:p>
+      <w:pPr>
+        <w:pStyle w:val="ListBullet"/>
+        <w:spacing w:before="0" w:after="30"/>
+        <w:ind w:left="317" w:hanging="230"/>
+      </w:pPr>
+      <w:r>
+        <w:rPr>
+          <w:sz w:val="20"/>
+        </w:rPr>
+        <w:t>Maintained the cluster's software environment (130 commits to the HPCC module tree, 2017-2019) and the HPCC website (94 commits).</w:t>
       </w:r>
     </w:p>
     <w:p>

</xml_diff>